<commit_message>
Ada Koch I: errores de continuidad
- Cuaderno único: Iter vive en el cuaderno de la página del martes, no en la caja.
  Álvaro y el mar ya no ven dibujos de otras edades; la regla lo dice.
- Goma y lápiz: el lápiz cae junto al baúl; en el 28 los lápices están en la torre.
- Calendario: faltan seis días para el 12; Iter calla la primera mañana y habla la
  siguiente a lo del perro; el apretón con Brais fue hace cinco días.
- La regla tras la resurrección queda planteada en el 29.
- bilbaína, A Vella, cincuenta y dos años, agua a dieciséis grados (US y ES).

Co-Authored-By: Claude Opus 5.5 <noreply@anthropic.com>
Claude-Session: https://claude.ai/code/session_01HymiadRDUPzWBtequ8tm6m
</commit_message>
<xml_diff>
--- a/ada_koch/libro_1/El_hombre_que_esperaba.docx
+++ b/ada_koch/libro_1/El_hombre_que_esperaba.docx
@@ -153,7 +153,7 @@
         <w:pStyle w:val="BodyText"/>
       </w:pPr>
       <w:r>
-        <w:t xml:space="preserve">Cogí el móvil para mirar la boya. Trece grados.</w:t>
+        <w:t xml:space="preserve">Cogí el móvil para mirar la boya. Dieciséis grados.</w:t>
       </w:r>
     </w:p>
     <w:p>
@@ -2332,7 +2332,7 @@
           <w:iCs/>
           <w:i/>
         </w:rPr>
-        <w:t xml:space="preserve">a Vella</w:t>
+        <w:t xml:space="preserve">A Vella</w:t>
       </w:r>
       <w:r>
         <w:t xml:space="preserve"> </w:t>
@@ -2364,7 +2364,7 @@
           <w:iCs/>
           <w:i/>
         </w:rPr>
-        <w:t xml:space="preserve">a Vella</w:t>
+        <w:t xml:space="preserve">A Vella</w:t>
       </w:r>
       <w:r>
         <w:t xml:space="preserve">, medio escondida entre la espuma. Redonda por arriba, plana, con una especie de escalón en un lado, como un asiento. Llevaba un año bañándome allí y nunca me había fijado en ella.</w:t>
@@ -8150,7 +8150,7 @@
         <w:pStyle w:val="BodyText"/>
       </w:pPr>
       <w:r>
-        <w:t xml:space="preserve">—Mucho. Trece grados.</w:t>
+        <w:t xml:space="preserve">—Mucho. Quince grados.</w:t>
       </w:r>
     </w:p>
     <w:p>
@@ -10693,7 +10693,7 @@
           <w:iCs/>
           <w:i/>
         </w:rPr>
-        <w:t xml:space="preserve">a Vella</w:t>
+        <w:t xml:space="preserve">A Vella</w:t>
       </w:r>
       <w:r>
         <w:t xml:space="preserve"> </w:t>
@@ -13836,7 +13836,7 @@
         <w:pStyle w:val="BodyText"/>
       </w:pPr>
       <w:r>
-        <w:t xml:space="preserve">Nunca más me corrigió. Ni en cincuenta y tres años.</w:t>
+        <w:t xml:space="preserve">Nunca más me corrigió. Ni en cincuenta y dos años.</w:t>
       </w:r>
     </w:p>
     <w:p>
@@ -18405,7 +18405,7 @@
         <w:pStyle w:val="BodyText"/>
       </w:pPr>
       <w:r>
-        <w:t xml:space="preserve">Doce de noviembre. Faltaban tres semanas.</w:t>
+        <w:t xml:space="preserve">Doce de noviembre. Faltaban seis días.</w:t>
       </w:r>
     </w:p>
     <w:p>
@@ -18972,7 +18972,7 @@
           <w:iCs/>
           <w:i/>
         </w:rPr>
-        <w:t xml:space="preserve">a Vella</w:t>
+        <w:t xml:space="preserve">A Vella</w:t>
       </w:r>
       <w:r>
         <w:t xml:space="preserve">.</w:t>
@@ -19038,7 +19038,7 @@
         <w:pStyle w:val="FirstParagraph"/>
       </w:pPr>
       <w:r>
-        <w:t xml:space="preserve">No sé cuánto tiempo nadé. Un minuto. Cinco. Se me cansaron los brazos. Se me entumecieron las piernas. El agua estaba a trece grados, o a doce, y yo llevaba demasiado tiempo dentro.</w:t>
+        <w:t xml:space="preserve">No sé cuánto tiempo nadé. Un minuto. Cinco. Se me cansaron los brazos. Se me entumecieron las piernas. El agua estaba a quince grados, o a catorce, y yo llevaba demasiado tiempo dentro.</w:t>
       </w:r>
     </w:p>
     <w:p>
@@ -19633,7 +19633,7 @@
         <w:pStyle w:val="BodyText"/>
       </w:pPr>
       <w:r>
-        <w:t xml:space="preserve">Dentro olía a leña y a café. Una cocina grande, de piedra, con una cocina bilbaina de hierro negro encendida y una mesa de madera llena de cosas: redes a medio coser, una radio, un plato con migas.</w:t>
+        <w:t xml:space="preserve">Dentro olía a leña y a café. Una cocina grande, de piedra, con una cocina bilbaína de hierro negro encendida y una mesa de madera llena de cosas: redes a medio coser, una radio, un plato con migas.</w:t>
       </w:r>
     </w:p>
     <w:p>
@@ -21456,7 +21456,7 @@
         <w:pStyle w:val="BodyText"/>
       </w:pPr>
       <w:r>
-        <w:t xml:space="preserve">Luego señaló el lápiz, que se me había caído al suelo al lado de la goma. Luego me señaló a mí.</w:t>
+        <w:t xml:space="preserve">Luego señaló el lápiz, que se me había caído al suelo junto al baúl. Luego me señaló a mí.</w:t>
       </w:r>
     </w:p>
     <w:p>
@@ -23534,7 +23534,7 @@
         <w:pStyle w:val="FirstParagraph"/>
       </w:pPr>
       <w:r>
-        <w:t xml:space="preserve">Se lo dije a la mañana siguiente. En la cocina. Ella estaba haciendo café, de espaldas.</w:t>
+        <w:t xml:space="preserve">La primera mañana no se lo dije. Ella estaba contenta, y yo también, y no quise romperlo. Se lo dije la mañana después de lo del perro. En la cocina. Ella estaba haciendo café, de espaldas.</w:t>
       </w:r>
     </w:p>
     <w:p>
@@ -25442,7 +25442,7 @@
         <w:pStyle w:val="FirstParagraph"/>
       </w:pPr>
       <w:r>
-        <w:t xml:space="preserve">Cayó al suelo entre los tres. Abierto. Por una página de los dieciséis años. Yo, de perfil, con los labios entreabiertos, mirando algo fuera del papel.</w:t>
+        <w:t xml:space="preserve">Cayó al suelo entre los tres. Abierto. Por mi página. La del martes. Yo entero, de frente, mirando algo fuera del papel.</w:t>
       </w:r>
     </w:p>
     <w:p>
@@ -25466,7 +25466,7 @@
         <w:pStyle w:val="BodyText"/>
       </w:pPr>
       <w:r>
-        <w:t xml:space="preserve">Pasó las páginas. Despacio. Yo con veinte años. Yo con la cicatriz. Yo sentado en la roca. Yo. Yo. Yo.</w:t>
+        <w:t xml:space="preserve">Pasó las páginas. Despacio. Yo en la roca de la cala. Yo de espaldas, mirando el mar. Yo esperando. Yo. Yo. Yo.</w:t>
       </w:r>
     </w:p>
     <w:p>
@@ -25696,7 +25696,7 @@
         <w:pStyle w:val="BodyText"/>
       </w:pPr>
       <w:r>
-        <w:t xml:space="preserve">Y si el papel se moja, me mojo por dentro. Si el papel se rompe, me rompo.</w:t>
+        <w:t xml:space="preserve">Y si el papel se moja, me mojo por dentro. Si el papel se rompe, me rompo. Y no vivo en todos los cuadernos de la caja: vivo en ese, en el de la página del martes, donde me terminó.</w:t>
       </w:r>
     </w:p>
     <w:p>
@@ -26123,7 +26123,7 @@
         <w:pStyle w:val="BodyText"/>
       </w:pPr>
       <w:r>
-        <w:t xml:space="preserve">Una hoja pasó a mi lado, pegada a la roca por la lluvia. La arranqué. Una mano. Su mano de los doce años, con la espada de madera. Me la metí en el sujetador, contra la piel, sin saber por qué.</w:t>
+        <w:t xml:space="preserve">Una hoja pasó a mi lado, pegada a la roca por la lluvia. La arranqué. Una mano. Su mano, sola, uno de los estudios que yo hacía de noche antes de que llegara. Me la metí en el sujetador, contra la piel, sin saber por qué.</w:t>
       </w:r>
     </w:p>
     <w:p>
@@ -26458,7 +26458,7 @@
           <w:iCs/>
           <w:i/>
         </w:rPr>
-        <w:t xml:space="preserve">a Vella</w:t>
+        <w:t xml:space="preserve">A Vella</w:t>
       </w:r>
       <w:r>
         <w:t xml:space="preserve">, la redonda, la del escalón. La roca del niño.</w:t>
@@ -27005,7 +27005,7 @@
         <w:pStyle w:val="BodyText"/>
       </w:pPr>
       <w:r>
-        <w:t xml:space="preserve">—No tengo lápiz. —Lo dijo como se dice que no hay aire—. Se me cayó en la torre. Se me cayó por la escalera. No tengo…</w:t>
+        <w:t xml:space="preserve">—No tengo lápiz. —Lo dijo como se dice que no hay aire—. Están arriba, en la torre. No me da tiempo. No tengo…</w:t>
       </w:r>
     </w:p>
     <w:p>
@@ -28213,7 +28213,7 @@
         <w:pStyle w:val="BodyText"/>
       </w:pPr>
       <w:r>
-        <w:t xml:space="preserve">Una nube. Otra nube. Él con doce años y la espada de madera. Él en el muelle de Hamburgo. Mi letra en la primera página:</w:t>
+        <w:t xml:space="preserve">Una nube. Otra nube. Él en la roca de la cala. Él de espaldas, mirando el mar. Mi letra en la primera página:</w:t>
       </w:r>
       <w:r>
         <w:t xml:space="preserve"> </w:t>
@@ -28239,6 +28239,14 @@
         <w:pStyle w:val="BodyText"/>
       </w:pPr>
       <w:r>
+        <w:t xml:space="preserve">Las miré buscando su cara, y pensé lo que todavía no me atrevía a preguntar en voz alta. Si seguía atado a aquel papel deshecho, o a la hoja de la carpeta azul donde lo había vuelto a dibujar, o ya a nada. Esa noche no le había dolido nada. No se le había borrado nada. Lo guardé para otro día.</w:t>
+      </w:r>
+    </w:p>
+    <w:p>
+      <w:pPr>
+        <w:pStyle w:val="BodyText"/>
+      </w:pPr>
+      <w:r>
         <w:t xml:space="preserve">No pude hablar.</w:t>
       </w:r>
     </w:p>
@@ -28334,7 +28342,7 @@
         <w:pStyle w:val="BodyText"/>
       </w:pPr>
       <w:r>
-        <w:t xml:space="preserve">Julian se agachó y le rascó la tripa a Lúa. Luego se levantó, miró al hombre a los ojos, a la misma altura, y le tendió la mano otra vez. Como en la puerta, hacía tres días.</w:t>
+        <w:t xml:space="preserve">Julian se agachó y le rascó la tripa a Lúa. Luego se levantó, miró al hombre a los ojos, a la misma altura, y le tendió la mano otra vez. Como en la puerta, hacía cinco días.</w:t>
       </w:r>
     </w:p>
     <w:p>

</xml_diff>

<commit_message>
Ada Koch I: caps. 3-4 sin preparativos repetidos; más tensión erótica
- Fuera la segunda ronda de contraventanas, leña, velas y jarras; el recorrido de la
  videollamada ya no repite la leña ni las velas; fuera la charla de relleno con Lucía.
- Dibujo del cap. 3: las manos imaginadas en la nuca y la cintura.
- Cap. 17: la tercera noche en el sofá, interrumpida por ella.
- Cap. 22: la escena de amor, abierta y completa.

Co-Authored-By: Claude Opus 5.5 <noreply@anthropic.com>
Claude-Session: https://claude.ai/code/session_01HymiadRDUPzWBtequ8tm6m
</commit_message>
<xml_diff>
--- a/ada_koch/libro_1/El_hombre_que_esperaba.docx
+++ b/ada_koch/libro_1/El_hombre_que_esperaba.docx
@@ -2282,31 +2282,7 @@
         <w:pStyle w:val="FirstParagraph"/>
       </w:pPr>
       <w:r>
-        <w:t xml:space="preserve">Pasé la tarde preparando el faro para lo que venía.</w:t>
-      </w:r>
-    </w:p>
-    <w:p>
-      <w:pPr>
-        <w:pStyle w:val="BodyText"/>
-      </w:pPr>
-      <w:r>
-        <w:t xml:space="preserve">Es una rutina que he aprendido a fuerza de inviernos, aunque solo llevo uno. Revisar las contraventanas una por una y cerrar las que dan al oeste. Subir leña del cobertizo y apilarla junto a la estufa, hasta el techo. Llenar el depósito del generador, que es viejo y caprichoso y tose como un fumador antes de arrancar. Meter dentro la silla del porche, la maceta de romero, la cuerda de tender.</w:t>
-      </w:r>
-    </w:p>
-    <w:p>
-      <w:pPr>
-        <w:pStyle w:val="BodyText"/>
-      </w:pPr>
-      <w:r>
-        <w:t xml:space="preserve">Trabajaba con el viento en contra, despeinada, con las mejillas ardiendo de frío y las manos llenas de astillas. Me gustaba. Hay algo en preparar una casa para una tormenta que te hace sentir que la casa es tuya de verdad. Que la proteges. Que te protege.</w:t>
-      </w:r>
-    </w:p>
-    <w:p>
-      <w:pPr>
-        <w:pStyle w:val="BodyText"/>
-      </w:pPr>
-      <w:r>
-        <w:t xml:space="preserve">Antes de que se hiciera de noche bajé a la cala una última vez.</w:t>
+        <w:t xml:space="preserve">Pasé la tarde atrancando el faro contra lo que venía. Antes de que se hiciera de noche bajé a la cala una última vez.</w:t>
       </w:r>
     </w:p>
     <w:p>
@@ -2423,7 +2399,7 @@
         <w:pStyle w:val="BodyText"/>
       </w:pPr>
       <w:r>
-        <w:t xml:space="preserve">Cuando terminé, ya era de noche. Me di una ducha, me puse el pijama de franela y los calcetines gordos, y me calenté un cuenco del caldo de mi abuela. Sabía a grelos, a patata, a domingo de niña. Me lo tomé de pie junto a la ventana, con las dos manos alrededor del cuenco, mirando la oscuridad.</w:t>
+        <w:t xml:space="preserve">Cuando subí, ya era de noche. Me di una ducha, me puse el pijama de franela y los calcetines gordos, y me calenté un cuenco del caldo de mi abuela. Sabía a grelos, a patata, a domingo de niña. Me lo tomé de pie junto a la ventana, con las dos manos alrededor del cuenco, mirando la oscuridad.</w:t>
       </w:r>
     </w:p>
     <w:p>
@@ -2455,7 +2431,7 @@
         <w:pStyle w:val="BodyText"/>
       </w:pPr>
       <w:r>
-        <w:t xml:space="preserve">Le hice un recorrido con el móvil. La estufa, la leña apilada hasta el techo, las velas de mi abuela alineadas en la mesa como soldados, la ventana negra.</w:t>
+        <w:t xml:space="preserve">Le hice un recorrido con el móvil. La estufa, la ventana negra, el mar que no se veía y se oía.</w:t>
       </w:r>
     </w:p>
     <w:p>
@@ -2520,14 +2496,6 @@
       </w:pPr>
       <w:r>
         <w:t xml:space="preserve">Me quedé callada un segundo. Nadie me había dicho que estaba guapa en mucho tiempo. Ni siquiera yo.</w:t>
-      </w:r>
-    </w:p>
-    <w:p>
-      <w:pPr>
-        <w:pStyle w:val="BodyText"/>
-      </w:pPr>
-      <w:r>
-        <w:t xml:space="preserve">Hablamos un rato más. Del trabajo, de Marcos y su camisa de cuadros, del colegio de su hijo, de una serie que tenía que ver sin falta. Cosas pequeñas, cálidas, de esas que te recuerdan que hay una vida normal en algún sitio, esperándote.</w:t>
       </w:r>
     </w:p>
     <w:p>
@@ -2796,7 +2764,7 @@
         <w:pStyle w:val="BodyText"/>
       </w:pPr>
       <w:r>
-        <w:t xml:space="preserve">Las miré mucho rato. Me pregunté cómo serían sobre mi piel. Si serían ásperas o suaves. Si serían lentas.</w:t>
+        <w:t xml:space="preserve">Las miré mucho rato. Me pregunté cómo serían sobre mi piel. Si serían ásperas o suaves. Si serían lentas. Me imaginé una en la nuca, debajo del pelo. La otra bajando por la espalda, vértebra a vértebra, sin prisa, hasta quedarse quieta en la curva de la cintura, justo donde empieza el pijama.</w:t>
       </w:r>
     </w:p>
     <w:p>
@@ -3405,22 +3373,6 @@
         <w:pStyle w:val="FirstParagraph"/>
       </w:pPr>
       <w:r>
-        <w:t xml:space="preserve">Pasé la mañana haciendo cosas pequeñas con las manos.</w:t>
-      </w:r>
-    </w:p>
-    <w:p>
-      <w:pPr>
-        <w:pStyle w:val="BodyText"/>
-      </w:pPr>
-      <w:r>
-        <w:t xml:space="preserve">Llené jarras de agua por si fallaba la bomba. Puse las velas de mi abuela en la mesa, junto a la caja de cerillas. Revisé otra vez las contraventanas, una por una, con el viento empujándome contra la pared cada vez que me asomaba a la puerta. La lluvia me empapó en diez segundos.</w:t>
-      </w:r>
-    </w:p>
-    <w:p>
-      <w:pPr>
-        <w:pStyle w:val="BodyText"/>
-      </w:pPr>
-      <w:r>
         <w:t xml:space="preserve">A mediodía subí a la torre.</w:t>
       </w:r>
     </w:p>
@@ -3741,14 +3693,6 @@
         <w:pStyle w:val="BodyText"/>
       </w:pPr>
       <w:r>
-        <w:t xml:space="preserve">Las velas se fueron gastando. La estufa también. No me levanté a echarle leña.</w:t>
-      </w:r>
-    </w:p>
-    <w:p>
-      <w:pPr>
-        <w:pStyle w:val="BodyText"/>
-      </w:pPr>
-      <w:r>
         <w:t xml:space="preserve">Pensé en mi abuela, sola en su casa de ventanas azules. La imaginé sentada en su cocina con la radio de pilas, rezando bajito, o no rezando, o cantando sin darse cuenta como cantaba en la fábrica de Stuttgart.</w:t>
       </w:r>
     </w:p>
@@ -16780,7 +16724,47 @@
         <w:pStyle w:val="BodyText"/>
       </w:pPr>
       <w:r>
-        <w:t xml:space="preserve">Dormíamos separados. Él en el sofá, yo en mi cuarto con la puerta abierta. Ninguno de los dos lo propuso. Ninguno de los dos se movió. Por las noches lo oía respirar desde mi cama, y sabía que él me oía a mí.</w:t>
+        <w:t xml:space="preserve">Dormíamos separados. Él en el sofá, yo en mi cuarto con la puerta abierta. Ninguno de los dos lo propuso.</w:t>
+      </w:r>
+    </w:p>
+    <w:p>
+      <w:pPr>
+        <w:pStyle w:val="BodyText"/>
+      </w:pPr>
+      <w:r>
+        <w:t xml:space="preserve">La tercera noche casi no paramos. Fue en el sofá, con la estufa encendida y la manta de cuadros resbalando al suelo. Me besó como lo hacía todo, aprendiendo, y luego ya no aprendía nada: sabía. Le metí las manos por debajo del jersey y él contuvo el aire, como si el frío fuera yo. Me tumbó sobre los cojines sin dejar de mirarme, y su mano encontró la piel de mi cintura y se quedó allí, abierta, temblando un poco, pidiéndome permiso sin palabras. Yo arqueé la espalda contra ella. Él bajó la boca a mi cuello y dijo mi nombre ahí, contra el pulso.</w:t>
+      </w:r>
+    </w:p>
+    <w:p>
+      <w:pPr>
+        <w:pStyle w:val="BodyText"/>
+      </w:pPr>
+      <w:r>
+        <w:t xml:space="preserve">Fui yo la que paró. Me dije que no sabía por qué. Sí lo sabía: tenía miedo de que, si me daba entera, el lápiz dejara de ser mío.</w:t>
+      </w:r>
+    </w:p>
+    <w:p>
+      <w:pPr>
+        <w:pStyle w:val="BodyText"/>
+      </w:pPr>
+      <w:r>
+        <w:t xml:space="preserve">Él se apartó sin una queja. Se quedó sentado en el suelo, con la espalda contra el sofá y la respiración rota, y me cogió la mano por encima del hombro.</w:t>
+      </w:r>
+    </w:p>
+    <w:p>
+      <w:pPr>
+        <w:pStyle w:val="BodyText"/>
+      </w:pPr>
+      <w:r>
+        <w:t xml:space="preserve">—Cuando tú quieras —dijo.</w:t>
+      </w:r>
+    </w:p>
+    <w:p>
+      <w:pPr>
+        <w:pStyle w:val="BodyText"/>
+      </w:pPr>
+      <w:r>
+        <w:t xml:space="preserve">Esa noche tampoco me moví de mi cama. Lo oía respirar desde allí, y sabía que él me oía a mí.</w:t>
       </w:r>
     </w:p>
     <w:p>
@@ -22025,7 +22009,55 @@
         <w:pStyle w:val="BodyText"/>
       </w:pPr>
       <w:r>
-        <w:t xml:space="preserve">Fue lento. Fue torpe. Fue la primera vez para él y no lo era para mí, y sin embargo era yo la que temblaba. Me tocó como me había mirado siempre: aprendiendo. Como si mi piel fuera un mapa del tiempo y él tuviera que leerlo entero. Cada vez que yo contenía el aire, él se paraba, y me miraba, y esperaba. Y luego seguía.</w:t>
+        <w:t xml:space="preserve">Le desabroché el pantalón con los dedos torpes, todavía pegajosos de sal. Él me bajó el mío despacio, de rodillas al pie de la cama, como se le quita la funda a algo que puede romperse, y se quedó mirándome a la luz azul que entraba por la ventana. No dijo nada. Nadie me había mirado nunca así: como si la que acababa de aparecer en el mundo fuera yo.</w:t>
+      </w:r>
+    </w:p>
+    <w:p>
+      <w:pPr>
+        <w:pStyle w:val="BodyText"/>
+      </w:pPr>
+      <w:r>
+        <w:t xml:space="preserve">Fue lento. Fue torpe. Fue la primera vez para él y no lo era para mí, y sin embargo era yo la que temblaba. Me tocó como me había mirado siempre: aprendiendo. Como si mi piel fuera un mapa del tiempo y él tuviera que leerlo entero. La boca en el hueco de la clavícula. La mano nueva bajando por mi vientre, sin prisa, preguntando. Cada vez que yo contenía el aire, él se paraba, y me miraba, y esperaba. Y luego seguía, un poco más abajo, un poco más hondo, hasta que dejé de contener nada.</w:t>
+      </w:r>
+    </w:p>
+    <w:p>
+      <w:pPr>
+        <w:pStyle w:val="BodyText"/>
+      </w:pPr>
+      <w:r>
+        <w:t xml:space="preserve">Cuando entró en mí, los dos nos quedamos quietos. Le sentí el corazón contra el pecho, desbocado, igual que el mío. Abrió los ojos en la oscuridad y me buscó, y yo le sostuve la cara entre las manos para que no tuviera que buscarme.</w:t>
+      </w:r>
+    </w:p>
+    <w:p>
+      <w:pPr>
+        <w:pStyle w:val="BodyText"/>
+      </w:pPr>
+      <w:r>
+        <w:t xml:space="preserve">—Ada —dijo. Solo eso. Con la voz que yo le había devuelto esa misma tarde.</w:t>
+      </w:r>
+    </w:p>
+    <w:p>
+      <w:pPr>
+        <w:pStyle w:val="BodyText"/>
+      </w:pPr>
+      <w:r>
+        <w:t xml:space="preserve">Nos movimos juntos, al principio sin saber, luego sabiendo. Le clavé los dedos en la espalda, en el lunar que yo no le había dibujado. Él aprendió deprisa lo que me hacía cerrar los ojos, y lo repitió, y lo repitió, hasta que el mar de fuera y el de dentro fueron el mismo y se me rompió la voz contra su hombro.</w:t>
+      </w:r>
+    </w:p>
+    <w:p>
+      <w:pPr>
+        <w:pStyle w:val="BodyText"/>
+      </w:pPr>
+      <w:r>
+        <w:t xml:space="preserve">Él vino detrás, con un temblor largo, diciendo mi nombre como si fuera la primera palabra que había aprendido.</w:t>
+      </w:r>
+    </w:p>
+    <w:p>
+      <w:pPr>
+        <w:pStyle w:val="BodyText"/>
+      </w:pPr>
+      <w:r>
+        <w:t xml:space="preserve">Luego nos quedamos enredados, sudando en el frío, escuchando la marea.</w:t>
       </w:r>
     </w:p>
     <w:p>

</xml_diff>

<commit_message>
Ada Koch I: sueño erótico premonitorio al abrir el libro, en las tres versiones
El capítulo 1 empieza con el sueño (tres golpes, el lunar, «Ya voy»), que luego se
cumple: «Yo no había dibujado ese lunar. Lo había soñado.» Las ediciones US y GB
reciben también los recortes de los caps. 3-4 y las escenas de los caps. 17 y 22.

Co-Authored-By: Claude Opus 5.5 <noreply@anthropic.com>
Claude-Session: https://claude.ai/code/session_01HymiadRDUPzWBtequ8tm6m
</commit_message>
<xml_diff>
--- a/ada_koch/libro_1/El_hombre_que_esperaba.docx
+++ b/ada_koch/libro_1/El_hombre_que_esperaba.docx
@@ -121,7 +121,63 @@
         <w:pStyle w:val="FirstParagraph"/>
       </w:pPr>
       <w:r>
-        <w:t xml:space="preserve">Me desperté antes que la alarma, como casi siempre desde que vivo sola.</w:t>
+        <w:t xml:space="preserve">Esa noche soñé con él.</w:t>
+      </w:r>
+    </w:p>
+    <w:p>
+      <w:pPr>
+        <w:pStyle w:val="BodyText"/>
+      </w:pPr>
+      <w:r>
+        <w:t xml:space="preserve">No con el niño de la roca. Con el hombre. Llamaba tres veces a una puerta que era la mía y no lo era, y cuando abría estaba allí, en el umbral, chorreando, con el pelo oscuro pegado a la frente y el mar entero detrás. No decía nada. Me miraba como se mira algo que se ha buscado mucho tiempo.</w:t>
+      </w:r>
+    </w:p>
+    <w:p>
+      <w:pPr>
+        <w:pStyle w:val="BodyText"/>
+      </w:pPr>
+      <w:r>
+        <w:t xml:space="preserve">Entraba sin que yo se lo pidiera. Dejaba un charco en las baldosas. Me apartaba el pelo de la cara con un dedo, y yo notaba el frío del agua en su mano y, debajo del frío, el calor.</w:t>
+      </w:r>
+    </w:p>
+    <w:p>
+      <w:pPr>
+        <w:pStyle w:val="BodyText"/>
+      </w:pPr>
+      <w:r>
+        <w:t xml:space="preserve">Me besaba despacio. Sabía a sal. Sus manos, grandes, de dedos largos, me encontraban la nuca, luego la espalda, luego la piel de la cintura por debajo de la camiseta, y se quedaban allí, abiertas, como si mi cuerpo fuera un sitio al que llevaba años intentando volver. Yo le quitaba la camisa mojada. Tenía un lunar debajo del hombro izquierdo. Me acuerdo de pensar, dentro del sueño, que ese lunar yo no se lo había dibujado nunca.</w:t>
+      </w:r>
+    </w:p>
+    <w:p>
+      <w:pPr>
+        <w:pStyle w:val="BodyText"/>
+      </w:pPr>
+      <w:r>
+        <w:t xml:space="preserve">Me llevaba contra la pared y yo me abría a él como se abre una ventana en un temporal, de una vez, sin poder cerrarla después. Le decía que sí antes de que preguntara. Él decía algo contra mi cuello. Mi nombre, creo. Con una voz que yo no le había oído nunca, porque nunca se la había dibujado.</w:t>
+      </w:r>
+    </w:p>
+    <w:p>
+      <w:pPr>
+        <w:pStyle w:val="BodyText"/>
+      </w:pPr>
+      <w:r>
+        <w:t xml:space="preserve">Y entonces, en lo más hondo, cuando ya no había pared ni puerta ni frío, se apartaba un poco, me miraba muy serio y decía:</w:t>
+      </w:r>
+    </w:p>
+    <w:p>
+      <w:pPr>
+        <w:pStyle w:val="BodyText"/>
+      </w:pPr>
+      <w:r>
+        <w:t xml:space="preserve">—Ya voy.</w:t>
+      </w:r>
+    </w:p>
+    <w:p>
+      <w:pPr>
+        <w:pStyle w:val="BodyText"/>
+      </w:pPr>
+      <w:r>
+        <w:t xml:space="preserve">Me desperté antes que la alarma, como casi siempre desde que vivo sola. Esta vez, con el corazón golpeándome las costillas y las sábanas enredadas en las piernas.</w:t>
       </w:r>
     </w:p>
     <w:p>
@@ -5473,7 +5529,7 @@
         <w:pStyle w:val="BodyText"/>
       </w:pPr>
       <w:r>
-        <w:t xml:space="preserve">Yo no había dibujado ese lunar.</w:t>
+        <w:t xml:space="preserve">Yo no había dibujado ese lunar. Lo había soñado.</w:t>
       </w:r>
     </w:p>
     <w:p>

</xml_diff>

<commit_message>
Ada Koch I: el deseo por Brais antes de su nombre, unido al rechazo del ex
Detalles sutiles (antebrazos y cicatriz, camiseta al viento, cada roce al desvestirla,
la toalla) y otros menos sutiles junto al asco por el ex (las manos agrietadas frente a
las manos limpias; en el muelle, de pie en la borda). Llegada del ex «en seis días».
En las tres versiones.

Co-Authored-By: Claude Opus 5.5 <noreply@anthropic.com>
Claude-Session: https://claude.ai/code/session_01HymiadRDUPzWBtequ8tm6m
</commit_message>
<xml_diff>
--- a/ada_koch/libro_1/El_hombre_que_esperaba.docx
+++ b/ada_koch/libro_1/El_hombre_que_esperaba.docx
@@ -11651,7 +11651,7 @@
         <w:pStyle w:val="BodyText"/>
       </w:pPr>
       <w:r>
-        <w:t xml:space="preserve">Abrió mi capó sin preguntar. Abrió el suyo. Conectó las pinzas con la soltura de quien lo ha hecho mil veces, sin mirar casi, mientras me hablaba por encima del hombro.</w:t>
+        <w:t xml:space="preserve">Abrió mi capó sin preguntar. Abrió el suyo. Conectó las pinzas con la soltura de quien lo ha hecho mil veces, sin mirar casi, mientras me hablaba por encima del hombro. Llevaba las mangas subidas hasta el codo. Tenía los antebrazos morenos, con una cicatriz blanca que le cruzaba uno de lado a lado, y me fijé en ella más rato del que hacía falta.</w:t>
       </w:r>
     </w:p>
     <w:p>
@@ -17681,7 +17681,7 @@
         <w:pStyle w:val="BodyText"/>
       </w:pPr>
       <w:r>
-        <w:t xml:space="preserve">Lo reconocí antes de verle la cara. Por el chubasquero. Por la forma de andar, sin prisa.</w:t>
+        <w:t xml:space="preserve">Lo reconocí antes de verle la cara. Por el chubasquero, abierto, con la camiseta pegada al pecho por el viento. Por la forma de andar, sin prisa.</w:t>
       </w:r>
     </w:p>
     <w:p>
@@ -19745,7 +19745,7 @@
         <w:pStyle w:val="BodyText"/>
       </w:pPr>
       <w:r>
-        <w:t xml:space="preserve">Lo hizo. Mirando a la pared todo el rato. Me quitó el bañador mojado con una delicadeza que no esperaba de unas manos tan grandes, me envolvió en la toalla seca, me metió el jersey por la cabeza como se lo mete una madre a un niño, me puso los calcetines. No me rozó ni una vez más de lo necesario.</w:t>
+        <w:t xml:space="preserve">Lo hizo. Mirando a la pared todo el rato. Me quitó el bañador mojado con una delicadeza que no esperaba de unas manos tan grandes, me envolvió en la toalla seca, me metió el jersey por la cabeza como se lo mete una madre a un niño, me puso los calcetines. No me rozó ni una vez más de lo necesario. Y aun así, temblando de frío y de miedo, noté cada una de las veces que me rozó.</w:t>
       </w:r>
     </w:p>
     <w:p>
@@ -19943,7 +19943,7 @@
         <w:pStyle w:val="BodyText"/>
       </w:pPr>
       <w:r>
-        <w:t xml:space="preserve">Le conté que había alguien en Madrid. Alguien con quien estuve tres años. Que me fui hace uno, de un día para otro, y que desde entonces no había querido saber nada de él. Que ahora me escribía. Que me había llamado. Que iba a venir a A Coruña en tres semanas y quería verme.</w:t>
+        <w:t xml:space="preserve">Le conté que había alguien en Madrid. Alguien con quien estuve tres años. Que me fui hace uno, de un día para otro, y que desde entonces no había querido saber nada de él. Que ahora me escribía. Que me había llamado. Que iba a venir a A Coruña en seis días y quería verme.</w:t>
       </w:r>
     </w:p>
     <w:p>
@@ -19960,6 +19960,14 @@
       </w:pPr>
       <w:r>
         <w:t xml:space="preserve">Que me echaba de menos.</w:t>
+      </w:r>
+    </w:p>
+    <w:p>
+      <w:pPr>
+        <w:pStyle w:val="BodyText"/>
+      </w:pPr>
+      <w:r>
+        <w:t xml:space="preserve">Mientras se lo contaba me di cuenta de que le estaba mirando las manos. Las tenía sobre la mesa, abiertas, agrietadas de sal, quietas, sin pedir nada. Pensé en otras manos, siempre limpias, siempre secas, que sabían exactamente dónde apretar para que pareciera una caricia. Se me encogió el estómago de asco. Y luego, en el mismo sitio, de otra cosa. Me dieron ganas de coger una de aquellas manos agrietadas y ponérmela en la cara. No lo hice. Pero las ganas se quedaron conmigo toda la tarde.</w:t>
       </w:r>
     </w:p>
     <w:p>
@@ -23412,7 +23420,7 @@
         <w:pStyle w:val="BodyText"/>
       </w:pPr>
       <w:r>
-        <w:t xml:space="preserve">El de las pinzas asintió despacio. Me buscó con los ojos por encima del hombro de Iter. Me encontró en el pasillo, en toalla, con el pelo lleno de espuma. No sonrió.</w:t>
+        <w:t xml:space="preserve">El de las pinzas asintió despacio. Me buscó con los ojos por encima del hombro de Iter. Me encontró en el pasillo, en toalla, con el pelo lleno de espuma. No sonrió. Yo apreté la toalla contra el pecho y noté que me ardía la piel, toda a la vez, debajo de la tela.</w:t>
       </w:r>
     </w:p>
     <w:p>
@@ -24850,6 +24858,14 @@
       </w:pPr>
       <w:r>
         <w:t xml:space="preserve">Poco a poco. Como se borra el sol detrás de un cirro. Y debajo vi, durante un segundo, una cara que todo el pueblo vio también. Que mi abuela vio. Que el de las pinzas vio desde su barca, porque se levantó.</w:t>
+      </w:r>
+    </w:p>
+    <w:p>
+      <w:pPr>
+        <w:pStyle w:val="BodyText"/>
+      </w:pPr>
+      <w:r>
+        <w:t xml:space="preserve">Lo vi ponerse de pie en la borda, ancho, con la aguja todavía en la mano y la red cayéndole de las rodillas, y algo bajo y caliente se me levantó por dentro con él. Delante del hombre con el que había compartido cama tres años sentí asco: de su abrigo abrochado, de su colonia cara, de la boca que me había besado mil veces para callarme. Y al mismo tiempo, sin permiso, unas ganas que no supe dónde meter de cruzar el muelle y apoyar la frente en el pecho del que cosía redes.</w:t>
       </w:r>
     </w:p>
     <w:p>

</xml_diff>

<commit_message>
Ada Koch I: el deseo por Brais, recolocado; el lunar, de arriba
- Fuera la piel que arde en toalla (día siguiente a la noche con Julian); pasa al
  cap. 21, bajo el jersey del padre de Brais, antes de la galería.
- El muelle vuelve a ser solo de Ada; el deseo unido al asco por el ex pasa a la
  playa del cap. 18, con el mensaje «Es importante» en el bolsillo.
- El lunar del sueño: «Y no sabía quién me lo había puesto en el sueño.»
- Primeras palabras: «La noche antes de que empezara todo, soñé con él.»

Co-Authored-By: Claude Opus 5.5 <noreply@anthropic.com>
Claude-Session: https://claude.ai/code/session_01HymiadRDUPzWBtequ8tm6m
</commit_message>
<xml_diff>
--- a/ada_koch/libro_1/El_hombre_que_esperaba.docx
+++ b/ada_koch/libro_1/El_hombre_que_esperaba.docx
@@ -121,7 +121,7 @@
         <w:pStyle w:val="FirstParagraph"/>
       </w:pPr>
       <w:r>
-        <w:t xml:space="preserve">Esa noche soñé con él.</w:t>
+        <w:t xml:space="preserve">La noche antes de que empezara todo, soñé con él.</w:t>
       </w:r>
     </w:p>
     <w:p>
@@ -5529,7 +5529,7 @@
         <w:pStyle w:val="BodyText"/>
       </w:pPr>
       <w:r>
-        <w:t xml:space="preserve">Yo no había dibujado ese lunar. Lo había soñado.</w:t>
+        <w:t xml:space="preserve">Yo no había dibujado ese lunar. Lo había soñado. Y no sabía quién me lo había puesto en el sueño.</w:t>
       </w:r>
     </w:p>
     <w:p>
@@ -17800,6 +17800,27 @@
         <w:pStyle w:val="BodyText"/>
       </w:pPr>
       <w:r>
+        <w:t xml:space="preserve">Lo miré de reojo. Sentado en la arena con los antebrazos sobre las rodillas, ancho, quieto, oliendo a sal y a gasoil. En el bolsillo yo llevaba el mensaje de otro hombre,</w:t>
+      </w:r>
+      <w:r>
+        <w:t xml:space="preserve"> </w:t>
+      </w:r>
+      <w:r>
+        <w:rPr>
+          <w:iCs/>
+          <w:i/>
+        </w:rPr>
+        <w:t xml:space="preserve">Es importante</w:t>
+      </w:r>
+      <w:r>
+        <w:t xml:space="preserve">, y me dio asco: de su prisa, de su colonia cara, de la boca que me había besado mil veces para callarme. Y en el mismo sitio del asco, sin permiso, me nacieron unas ganas que no supe dónde meter. De acercarme ese metro. De apoyar la frente en aquel pecho y quedarme ahí.</w:t>
+      </w:r>
+    </w:p>
+    <w:p>
+      <w:pPr>
+        <w:pStyle w:val="BodyText"/>
+      </w:pPr>
+      <w:r>
         <w:t xml:space="preserve">Se puso a hablar él. De cosas pequeñas. De que esa playa era la mejor de la costa para el percebe, pero solo con la marea muy baja, y que él tenía licencia desde hacía tres años. Que antes trabajaba en una plataforma petrolífera en el mar del Norte, en Noruega, tres semanas dentro y tres fuera, ganando mucho dinero y no viendo el sol en invierno.</w:t>
       </w:r>
     </w:p>
@@ -20461,6 +20482,14 @@
         <w:pStyle w:val="BodyText"/>
       </w:pPr>
       <w:r>
+        <w:t xml:space="preserve">Me lo dijo mirándome a la cara, y fue entonces cuando me di cuenta de que debajo del jersey de su padre no llevaba nada, y de que me ardía la piel, toda a la vez, debajo de la lana.</w:t>
+      </w:r>
+    </w:p>
+    <w:p>
+      <w:pPr>
+        <w:pStyle w:val="BodyText"/>
+      </w:pPr>
+      <w:r>
         <w:t xml:space="preserve">Bajé. Lúa gimió detrás. La furgoneta dio la vuelta y se fue hacia el pueblo, y yo me quedé en el arcén, con el jersey de un muerto puesto y las botas en la mano, y empecé a subir hacia el faro.</w:t>
       </w:r>
     </w:p>
@@ -23420,7 +23449,7 @@
         <w:pStyle w:val="BodyText"/>
       </w:pPr>
       <w:r>
-        <w:t xml:space="preserve">El de las pinzas asintió despacio. Me buscó con los ojos por encima del hombro de Iter. Me encontró en el pasillo, en toalla, con el pelo lleno de espuma. No sonrió. Yo apreté la toalla contra el pecho y noté que me ardía la piel, toda a la vez, debajo de la tela.</w:t>
+        <w:t xml:space="preserve">El de las pinzas asintió despacio. Me buscó con los ojos por encima del hombro de Iter. Me encontró en el pasillo, en toalla, con el pelo lleno de espuma. No sonrió.</w:t>
       </w:r>
     </w:p>
     <w:p>
@@ -24858,14 +24887,6 @@
       </w:pPr>
       <w:r>
         <w:t xml:space="preserve">Poco a poco. Como se borra el sol detrás de un cirro. Y debajo vi, durante un segundo, una cara que todo el pueblo vio también. Que mi abuela vio. Que el de las pinzas vio desde su barca, porque se levantó.</w:t>
-      </w:r>
-    </w:p>
-    <w:p>
-      <w:pPr>
-        <w:pStyle w:val="BodyText"/>
-      </w:pPr>
-      <w:r>
-        <w:t xml:space="preserve">Lo vi ponerse de pie en la borda, ancho, con la aguja todavía en la mano y la red cayéndole de las rodillas, y algo bajo y caliente se me levantó por dentro con él. Delante del hombre con el que había compartido cama tres años sentí asco: de su abrigo abrochado, de su colonia cara, de la boca que me había besado mil veces para callarme. Y al mismo tiempo, sin permiso, unas ganas que no supe dónde meter de cruzar el muelle y apoyar la frente en el pecho del que cosía redes.</w:t>
       </w:r>
     </w:p>
     <w:p>

</xml_diff>

<commit_message>
Ada Koch I: pasada del análisis — clímax nativo, maltrato insinuado, ficha, «mucho rato»
- «Él vino detrás» → «Luego se deshizo él» (EN: «Then he came undone»).
- Las otras manos ya no «sabían dónde apretar»: «nunca se quedaban quietas sin pedir
  algo a cambio». Indicio, no afirmación.
- Sinopsis y categorías nuevas en los tres EPUB: calor, triángulo, la abuela.
- «mucho rato»: de 26 a 14.

Co-Authored-By: Claude Opus 5.5 <noreply@anthropic.com>
Claude-Session: https://claude.ai/code/session_01HymiadRDUPzWBtequ8tm6m
</commit_message>
<xml_diff>
--- a/ada_koch/libro_1/El_hombre_que_esperaba.docx
+++ b/ada_koch/libro_1/El_hombre_que_esperaba.docx
@@ -2820,7 +2820,7 @@
         <w:pStyle w:val="BodyText"/>
       </w:pPr>
       <w:r>
-        <w:t xml:space="preserve">Las miré mucho rato. Me pregunté cómo serían sobre mi piel. Si serían ásperas o suaves. Si serían lentas. Me imaginé una en la nuca, debajo del pelo. La otra bajando por la espalda, vértebra a vértebra, sin prisa, hasta quedarse quieta en la curva de la cintura, justo donde empieza el pijama.</w:t>
+        <w:t xml:space="preserve">Las estuve mirando. Me pregunté cómo serían sobre mi piel. Si serían ásperas o suaves. Si serían lentas. Me imaginé una en la nuca, debajo del pelo. La otra bajando por la espalda, vértebra a vértebra, sin prisa, hasta quedarse quieta en la curva de la cintura, justo donde empieza el pijama.</w:t>
       </w:r>
     </w:p>
     <w:p>
@@ -5824,7 +5824,7 @@
         <w:pStyle w:val="BodyText"/>
       </w:pPr>
       <w:r>
-        <w:t xml:space="preserve">Se quedó callado mucho rato. Bebió un sorbo de té. Hizo un gesto raro con la boca, de sorpresa, como si el sabor le hubiera pillado desprevenido. Luego me miró.</w:t>
+        <w:t xml:space="preserve">Se quedó callado. Bebió un sorbo de té. Hizo un gesto raro con la boca, de sorpresa, como si el sabor le hubiera pillado desprevenido. Luego me miró.</w:t>
       </w:r>
     </w:p>
     <w:p>
@@ -6490,7 +6490,7 @@
         <w:pStyle w:val="BodyText"/>
       </w:pPr>
       <w:r>
-        <w:t xml:space="preserve">Él miró la palabra mucho rato. Luego la repitió en voz baja, con su acento de piedras rodando.</w:t>
+        <w:t xml:space="preserve">Él miró la palabra sin parpadear. Luego la repitió en voz baja, con su acento de piedras rodando.</w:t>
       </w:r>
     </w:p>
     <w:p>
@@ -7379,7 +7379,7 @@
         <w:pStyle w:val="BodyText"/>
       </w:pPr>
       <w:r>
-        <w:t xml:space="preserve">Cerró los ojos. Estuvo así mucho rato. Fuera, el viento se había convertido en lluvia mansa, y se oía caer sobre el tejado como arena.</w:t>
+        <w:t xml:space="preserve">Cerró los ojos. Estuvo así un buen rato. Fuera, el viento se había convertido en lluvia mansa, y se oía caer sobre el tejado como arena.</w:t>
       </w:r>
     </w:p>
     <w:p>
@@ -8078,7 +8078,7 @@
         <w:pStyle w:val="BodyText"/>
       </w:pPr>
       <w:r>
-        <w:t xml:space="preserve">Después de comer se acercó a la ventana grande, la que da al mar, y se quedó allí de pie mucho rato.</w:t>
+        <w:t xml:space="preserve">Después de comer se acercó a la ventana grande, la que da al mar, y se quedó allí de pie, sin moverse.</w:t>
       </w:r>
     </w:p>
     <w:p>
@@ -8373,7 +8373,7 @@
         <w:pStyle w:val="BodyText"/>
       </w:pPr>
       <w:r>
-        <w:t xml:space="preserve">Se quedó mirando las líneas mucho rato. Con el ceño un poco fruncido. Con esa concentración suya que empezaba a conocer.</w:t>
+        <w:t xml:space="preserve">Se quedó mirando las líneas. Con el ceño un poco fruncido. Con esa concentración suya que empezaba a conocer.</w:t>
       </w:r>
     </w:p>
     <w:p>
@@ -8909,7 +8909,7 @@
         <w:pStyle w:val="BodyText"/>
       </w:pPr>
       <w:r>
-        <w:t xml:space="preserve">Miré la palabra «sola» mucho rato antes de enviarlo.</w:t>
+        <w:t xml:space="preserve">Dudé sobre la palabra «sola» antes de enviarlo.</w:t>
       </w:r>
     </w:p>
     <w:p>
@@ -13311,7 +13311,7 @@
         <w:pStyle w:val="FirstParagraph"/>
       </w:pPr>
       <w:r>
-        <w:t xml:space="preserve">Estuvimos callados mucho rato. Yo sentada, él de pie. La estufa crepitando. El mar abajo.</w:t>
+        <w:t xml:space="preserve">Estuvimos callados un buen rato. Yo sentada, él de pie. La estufa crepitando. El mar abajo.</w:t>
       </w:r>
     </w:p>
     <w:p>
@@ -19988,7 +19988,7 @@
         <w:pStyle w:val="BodyText"/>
       </w:pPr>
       <w:r>
-        <w:t xml:space="preserve">Mientras se lo contaba me di cuenta de que le estaba mirando las manos. Las tenía sobre la mesa, abiertas, agrietadas de sal, quietas, sin pedir nada. Pensé en otras manos, siempre limpias, siempre secas, que sabían exactamente dónde apretar para que pareciera una caricia. Se me encogió el estómago de asco. Y luego, en el mismo sitio, de otra cosa. Me dieron ganas de coger una de aquellas manos agrietadas y ponérmela en la cara. No lo hice. Pero las ganas se quedaron conmigo toda la tarde.</w:t>
+        <w:t xml:space="preserve">Mientras se lo contaba me di cuenta de que le estaba mirando las manos. Las tenía sobre la mesa, abiertas, agrietadas de sal, quietas, sin pedir nada. Pensé en otras manos, siempre limpias, siempre secas, que nunca se quedaban quietas sin pedir algo a cambio. Se me encogió el estómago de asco. Y luego, en el mismo sitio, de otra cosa. Me dieron ganas de coger una de aquellas manos agrietadas y ponérmela en la cara. No lo hice. Pero las ganas se quedaron conmigo toda la tarde.</w:t>
       </w:r>
     </w:p>
     <w:p>
@@ -21801,7 +21801,7 @@
         <w:pStyle w:val="BodyText"/>
       </w:pPr>
       <w:r>
-        <w:t xml:space="preserve">Se quedó mirando el dorso de la mano mucho rato. Luego la cerró en un puño y la apretó contra el pecho.</w:t>
+        <w:t xml:space="preserve">Se quedó mirando el dorso de la mano. Luego la cerró en un puño y la apretó contra el pecho.</w:t>
       </w:r>
     </w:p>
     <w:p>
@@ -22142,7 +22142,7 @@
         <w:pStyle w:val="BodyText"/>
       </w:pPr>
       <w:r>
-        <w:t xml:space="preserve">Él vino detrás, con un temblor largo, diciendo mi nombre como si fuera la primera palabra que había aprendido.</w:t>
+        <w:t xml:space="preserve">Luego se deshizo él, con un temblor largo, diciendo mi nombre como si fuera la primera palabra que había aprendido.</w:t>
       </w:r>
     </w:p>
     <w:p>
@@ -23165,7 +23165,7 @@
         <w:pStyle w:val="BodyText"/>
       </w:pPr>
       <w:r>
-        <w:t xml:space="preserve">La miré mucho rato. Dos letras. Después de un año de silencio.</w:t>
+        <w:t xml:space="preserve">La miré sin pulsar nada. Dos letras. Después de un año de silencio.</w:t>
       </w:r>
     </w:p>
     <w:p>
@@ -23969,7 +23969,7 @@
         <w:pStyle w:val="BodyText"/>
       </w:pPr>
       <w:r>
-        <w:t xml:space="preserve">La panadera me la dio. Me cobró. Me miró la cara mucho rato.</w:t>
+        <w:t xml:space="preserve">La panadera me la dio. Me cobró. Me miró la cara sin disimular.</w:t>
       </w:r>
     </w:p>
     <w:p>

</xml_diff>

<commit_message>
Ada Koch I: se publica con seudónimo, Ariadna Iturbe
Autora, orden de catálogo y derechos en los tres EPUB; colofón «en Barcelona»
(ES/US) y sin lugar en la edición de Orkney.

Co-Authored-By: Claude Opus 5.5 <noreply@anthropic.com>
Claude-Session: https://claude.ai/code/session_01HymiadRDUPzWBtequ8tm6m
</commit_message>
<xml_diff>
--- a/ada_koch/libro_1/El_hombre_que_esperaba.docx
+++ b/ada_koch/libro_1/El_hombre_que_esperaba.docx
@@ -83,19 +83,13 @@
         <w:pStyle w:val="Author"/>
       </w:pPr>
       <w:r>
-        <w:t xml:space="preserve">Íñigo</w:t>
+        <w:t xml:space="preserve">Ariadna</w:t>
       </w:r>
       <w:r>
         <w:t xml:space="preserve"> </w:t>
       </w:r>
       <w:r>
-        <w:t xml:space="preserve">Barrera</w:t>
-      </w:r>
-      <w:r>
-        <w:t xml:space="preserve"> </w:t>
-      </w:r>
-      <w:r>
-        <w:t xml:space="preserve">Barceló</w:t>
+        <w:t xml:space="preserve">Iturbe</w:t>
       </w:r>
     </w:p>
     <w:bookmarkStart w:id="36" w:name="primer-acto-el-faro"/>

</xml_diff>

<commit_message>
Ada Koch I: bisagra del asco solo en la cocina, ambigüedad del jersey, sinopsis sin spoiler, fuera el andamiaje del cap. 23
Co-Authored-By: Claude Opus 5.5 <noreply@anthropic.com>
Claude-Session: https://claude.ai/code/session_01HymiadRDUPzWBtequ8tm6m
</commit_message>
<xml_diff>
--- a/ada_koch/libro_1/El_hombre_que_esperaba.docx
+++ b/ada_koch/libro_1/El_hombre_que_esperaba.docx
@@ -17794,7 +17794,7 @@
         <w:pStyle w:val="BodyText"/>
       </w:pPr>
       <w:r>
-        <w:t xml:space="preserve">Lo miré de reojo. Sentado en la arena con los antebrazos sobre las rodillas, ancho, quieto, oliendo a sal y a gasoil. En el bolsillo yo llevaba el mensaje de otro hombre,</w:t>
+        <w:t xml:space="preserve">Lo miré de reojo. Sentado en la arena con los antebrazos sobre las rodillas, ancho, quieto, oliendo a sal y a gasoil. Tenía sal seca en la nuca, en el nacimiento del pelo, una costra blanca y fina, y yo me quedé mirándola como una tonta, pensando a qué sabría. Hacía frío y él desprendía calor como una piedra que ha estado todo el día al sol; lo notaba desde allí. Pensé, sin querer pensarlo, que bastaba con cruzar ese metro. Que podría apoyar la frente en aquel pecho y quedarme ahí. En el bolsillo yo llevaba el mensaje de otro hombre,</w:t>
       </w:r>
       <w:r>
         <w:t xml:space="preserve"> </w:t>
@@ -17807,7 +17807,7 @@
         <w:t xml:space="preserve">Es importante</w:t>
       </w:r>
       <w:r>
-        <w:t xml:space="preserve">, y me dio asco: de su prisa, de su colonia cara, de la boca que me había besado mil veces para callarme. Y en el mismo sitio del asco, sin permiso, me nacieron unas ganas que no supe dónde meter. De acercarme ese metro. De apoyar la frente en aquel pecho y quedarme ahí.</w:t>
+        <w:t xml:space="preserve">, y durante unos minutos se me olvidó que lo llevaba.</w:t>
       </w:r>
     </w:p>
     <w:p>
@@ -20476,7 +20476,7 @@
         <w:pStyle w:val="BodyText"/>
       </w:pPr>
       <w:r>
-        <w:t xml:space="preserve">Me lo dijo mirándome a la cara, y fue entonces cuando me di cuenta de que debajo del jersey de su padre no llevaba nada, y de que me ardía la piel, toda a la vez, debajo de la lana.</w:t>
+        <w:t xml:space="preserve">Me lo dijo mirándome a la cara, y fue entonces cuando me di cuenta de que yo no llevaba nada debajo del jersey de su padre, y de que me ardía la piel, toda a la vez, debajo de la lana.</w:t>
       </w:r>
     </w:p>
     <w:p>
@@ -22926,13 +22926,13 @@
       </w:r>
     </w:p>
     <w:bookmarkEnd w:id="65"/>
-    <w:bookmarkStart w:id="66" w:name="ada-continúa"/>
+    <w:bookmarkStart w:id="66" w:name="ada-23"/>
     <w:p>
       <w:pPr>
         <w:pStyle w:val="Heading3"/>
       </w:pPr>
       <w:r>
-        <w:t xml:space="preserve">23 · Ada (continúa)</w:t>
+        <w:t xml:space="preserve">Ada</w:t>
       </w:r>
     </w:p>
     <w:p>
@@ -24200,7 +24200,7 @@
     </w:p>
     <w:bookmarkEnd w:id="69"/>
     <w:bookmarkEnd w:id="70"/>
-    <w:bookmarkStart w:id="72" w:name="ada-23"/>
+    <w:bookmarkStart w:id="72" w:name="ada-24"/>
     <w:p>
       <w:pPr>
         <w:pStyle w:val="Heading2"/>
@@ -26204,7 +26204,7 @@
     </w:p>
     <w:bookmarkEnd w:id="73"/>
     <w:bookmarkEnd w:id="74"/>
-    <w:bookmarkStart w:id="76" w:name="ada-24"/>
+    <w:bookmarkStart w:id="76" w:name="ada-25"/>
     <w:p>
       <w:pPr>
         <w:pStyle w:val="Heading2"/>
@@ -27927,7 +27927,7 @@
     </w:p>
     <w:bookmarkEnd w:id="77"/>
     <w:bookmarkEnd w:id="78"/>
-    <w:bookmarkStart w:id="80" w:name="ada-25"/>
+    <w:bookmarkStart w:id="80" w:name="ada-26"/>
     <w:p>
       <w:pPr>
         <w:pStyle w:val="Heading2"/>
@@ -29441,7 +29441,7 @@
     </w:p>
     <w:bookmarkEnd w:id="79"/>
     <w:bookmarkEnd w:id="80"/>
-    <w:bookmarkStart w:id="81" w:name="ada-26"/>
+    <w:bookmarkStart w:id="81" w:name="ada-27"/>
     <w:p>
       <w:pPr>
         <w:pStyle w:val="Heading2"/>

</xml_diff>

<commit_message>
Ada Koch I y II: sin tío, menos autoburla; II: agencia de Ada blindada, primer secreto propio, Elisa 13 años, pasada de símiles y «despacio», final sin fórmula
Co-Authored-By: Claude Opus 5.5 <noreply@anthropic.com>
Claude-Session: https://claude.ai/code/session_01HymiadRDUPzWBtequ8tm6m
</commit_message>
<xml_diff>
--- a/ada_koch/libro_1/El_hombre_que_esperaba.docx
+++ b/ada_koch/libro_1/El_hombre_que_esperaba.docx
@@ -638,7 +638,7 @@
         <w:pStyle w:val="BodyText"/>
       </w:pPr>
       <w:r>
-        <w:t xml:space="preserve">Me sonrojé sola, en mi propia cocina. Ridículo.</w:t>
+        <w:t xml:space="preserve">Me sonrojé sola, en mi propia cocina.</w:t>
       </w:r>
     </w:p>
     <w:p>
@@ -1462,7 +1462,7 @@
         <w:pStyle w:val="BodyText"/>
       </w:pPr>
       <w:r>
-        <w:t xml:space="preserve">—Algo. —Chasqueó la lengua—. A tu edad yo dormía como un tronco. Claro que a tu edad ya tenía a tu madre y a tu tío, y llegaba a la cama tan cansada que me dormía rezando.</w:t>
+        <w:t xml:space="preserve">—Algo. —Chasqueó la lengua—. A tu edad yo dormía como un tronco. Claro que a tu edad ya tenía a tu madre, y llegaba a la cama tan cansada que me dormía rezando.</w:t>
       </w:r>
     </w:p>
     <w:p>
@@ -1829,7 +1829,7 @@
         <w:pStyle w:val="BodyText"/>
       </w:pPr>
       <w:r>
-        <w:t xml:space="preserve">—Cantaba los alalás fatal —dijo, con los ojos húmedos de reírse—. Desafinaba como un cerdo. Y le daba igual. Se ponía en la proa de la barca de tu tío y cantaba a gritos, y los gallegos de verdad se tapaban los oídos.</w:t>
+        <w:t xml:space="preserve">—Cantaba los alalás fatal —dijo, con los ojos húmedos de reírse—. Desafinaba como un cerdo. Y le daba igual. Se ponía en la proa de cualquier barca del puerto y cantaba a gritos, y los gallegos de verdad se tapaban los oídos.</w:t>
       </w:r>
     </w:p>
     <w:p>
@@ -3868,7 +3868,7 @@
         <w:pStyle w:val="BodyText"/>
       </w:pPr>
       <w:r>
-        <w:t xml:space="preserve">Abracé el cuaderno contra el pecho, sin abrirlo, como si fuera un osito de peluche. Ridículo. Una mujer de treinta y dos años abrazada a un cuaderno de dibujo en mitad de un temporal.</w:t>
+        <w:t xml:space="preserve">Abracé el cuaderno contra el pecho, sin abrirlo, y me quedé así, quieta, en mitad del temporal.</w:t>
       </w:r>
     </w:p>
     <w:p>
@@ -4419,7 +4419,7 @@
         <w:pStyle w:val="FirstParagraph"/>
       </w:pPr>
       <w:r>
-        <w:t xml:space="preserve">Cogí la linterna de la mesa. Pensé en coger también un cuchillo de la cocina y me sentí ridícula. Luego pensé que más ridículo sería no cogerlo. Al final no lo cogí. Quizá porque hay cosas que sabes con el cuerpo antes que con la cabeza.</w:t>
+        <w:t xml:space="preserve">Cogí la linterna de la mesa. Pensé en coger también un cuchillo de la cocina. Al final no lo cogí. Quizá porque hay cosas que sabes con el cuerpo antes que con la cabeza.</w:t>
       </w:r>
     </w:p>
     <w:p>

</xml_diff>